<commit_message>
Updated 2026 challenge Word template
</commit_message>
<xml_diff>
--- a/2026/papers/2026_cinc_template.docx
+++ b/2026/papers/2026_cinc_template.docx
@@ -1029,8 +1029,8 @@
                         <wps:cNvSpPr/>
                         <wps:spPr>
                           <a:xfrm>
-                            <a:off x="63360" y="1959480"/>
-                            <a:ext cx="2875320" cy="1729080"/>
+                            <a:off x="63360" y="1960200"/>
+                            <a:ext cx="2875320" cy="1728360"/>
                           </a:xfrm>
                           <a:prstGeom prst="rect">
                             <a:avLst/>
@@ -1174,7 +1174,7 @@
                   <v:stroke color="#3465a4" joinstyle="round" endcap="flat"/>
                   <w10:wrap type="topAndBottom"/>
                 </v:shape>
-                <v:rect id="shape_0" fillcolor="white" stroked="f" o:allowincell="f" style="position:absolute;left:138;top:3294;width:4527;height:2722;mso-wrap-style:square;v-text-anchor:top">
+                <v:rect id="shape_0" fillcolor="white" stroked="f" o:allowincell="f" style="position:absolute;left:138;top:3295;width:4527;height:2721;mso-wrap-style:square;v-text-anchor:top">
                   <v:fill o:detectmouseclick="t" type="solid" color2="black"/>
                   <v:stroke color="#3465a4" joinstyle="round" endcap="flat"/>
                   <v:textbox>
@@ -1992,7 +1992,7 @@
       </w:pPr>
       <w:r>
         <w:rPr/>
-        <w:t xml:space="preserve">Present your results here. We expect this to take approximately one half to one page. Remember to report the Challenge scores (weighted accuracy metric for the murmur detection task, and cost for the clinical outcome identification task) on the training, validation, and test sets. The scores that you receive from us before the conference use the hid- den validation set, and the scores that you receive from us after the conference use the hidden test set. You can use other metrics to provide insight into your method, but you should clearly report the Challenge scores. </w:t>
+        <w:t xml:space="preserve">Present your results here. We expect this to take approximately one half to one page. Remember to report the Challenge scores on the training, validation, and test sets. The scores that you receive from us before the conference use the hidden validation set, and the scores that you receive from us after the conference use the hidden test set. You can use other metrics to provide insight into your method, but you should clearly report the Challenge scores. </w:t>
       </w:r>
     </w:p>
     <w:p>
@@ -2032,8 +2032,8 @@
       </w:tblPr>
       <w:tblGrid>
         <w:gridCol w:w="1555"/>
-        <w:gridCol w:w="1554"/>
-        <w:gridCol w:w="1557"/>
+        <w:gridCol w:w="1553"/>
+        <w:gridCol w:w="1558"/>
       </w:tblGrid>
       <w:tr>
         <w:trPr/>
@@ -2059,7 +2059,7 @@
         </w:tc>
         <w:tc>
           <w:tcPr>
-            <w:tcW w:w="1554" w:type="dxa"/>
+            <w:tcW w:w="1553" w:type="dxa"/>
             <w:tcBorders>
               <w:top w:val="single" w:sz="2" w:space="0" w:color="000000"/>
               <w:bottom w:val="single" w:sz="2" w:space="0" w:color="000000"/>
@@ -2078,7 +2078,7 @@
         </w:tc>
         <w:tc>
           <w:tcPr>
-            <w:tcW w:w="1557" w:type="dxa"/>
+            <w:tcW w:w="1558" w:type="dxa"/>
             <w:tcBorders>
               <w:top w:val="single" w:sz="2" w:space="0" w:color="000000"/>
               <w:bottom w:val="single" w:sz="2" w:space="0" w:color="000000"/>
@@ -2120,7 +2120,7 @@
         </w:tc>
         <w:tc>
           <w:tcPr>
-            <w:tcW w:w="1554" w:type="dxa"/>
+            <w:tcW w:w="1553" w:type="dxa"/>
             <w:tcBorders>
               <w:bottom w:val="single" w:sz="2" w:space="0" w:color="000000"/>
             </w:tcBorders>
@@ -2138,7 +2138,7 @@
         </w:tc>
         <w:tc>
           <w:tcPr>
-            <w:tcW w:w="1557" w:type="dxa"/>
+            <w:tcW w:w="1558" w:type="dxa"/>
             <w:tcBorders>
               <w:bottom w:val="single" w:sz="2" w:space="0" w:color="000000"/>
               <w:end w:val="single" w:sz="2" w:space="0" w:color="000000"/>
@@ -2195,8 +2195,8 @@
       </w:tblPr>
       <w:tblGrid>
         <w:gridCol w:w="1555"/>
-        <w:gridCol w:w="1554"/>
-        <w:gridCol w:w="1557"/>
+        <w:gridCol w:w="1553"/>
+        <w:gridCol w:w="1558"/>
       </w:tblGrid>
       <w:tr>
         <w:trPr/>
@@ -2222,7 +2222,7 @@
         </w:tc>
         <w:tc>
           <w:tcPr>
-            <w:tcW w:w="1554" w:type="dxa"/>
+            <w:tcW w:w="1553" w:type="dxa"/>
             <w:tcBorders>
               <w:top w:val="single" w:sz="2" w:space="0" w:color="000000"/>
               <w:bottom w:val="single" w:sz="2" w:space="0" w:color="000000"/>
@@ -2241,7 +2241,7 @@
         </w:tc>
         <w:tc>
           <w:tcPr>
-            <w:tcW w:w="1557" w:type="dxa"/>
+            <w:tcW w:w="1558" w:type="dxa"/>
             <w:tcBorders>
               <w:top w:val="single" w:sz="2" w:space="0" w:color="000000"/>
               <w:bottom w:val="single" w:sz="2" w:space="0" w:color="000000"/>
@@ -2283,7 +2283,7 @@
         </w:tc>
         <w:tc>
           <w:tcPr>
-            <w:tcW w:w="1554" w:type="dxa"/>
+            <w:tcW w:w="1553" w:type="dxa"/>
             <w:tcBorders>
               <w:bottom w:val="single" w:sz="2" w:space="0" w:color="000000"/>
             </w:tcBorders>
@@ -2301,7 +2301,7 @@
         </w:tc>
         <w:tc>
           <w:tcPr>
-            <w:tcW w:w="1557" w:type="dxa"/>
+            <w:tcW w:w="1558" w:type="dxa"/>
             <w:tcBorders>
               <w:bottom w:val="single" w:sz="2" w:space="0" w:color="000000"/>
               <w:end w:val="single" w:sz="2" w:space="0" w:color="000000"/>
@@ -3300,8 +3300,8 @@
     <w:rsid w:val="00982849"/>
     <w:rPr/>
   </w:style>
-  <w:style w:type="character" w:styleId="FootnoteCharacters" w:customStyle="1">
-    <w:name w:val="Footnote Characters"/>
+  <w:style w:type="character" w:styleId="FootnoteCharactersuser" w:customStyle="1">
+    <w:name w:val="Footnote Characters (user)"/>
     <w:uiPriority w:val="99"/>
     <w:semiHidden/>
     <w:unhideWhenUsed/>
@@ -3311,8 +3311,8 @@
       <w:vertAlign w:val="superscript"/>
     </w:rPr>
   </w:style>
-  <w:style w:type="character" w:styleId="FootnoteCharactersuser" w:customStyle="1">
-    <w:name w:val="Footnote Characters (user)"/>
+  <w:style w:type="character" w:styleId="FootnoteCharacters" w:customStyle="1">
+    <w:name w:val="Footnote Characters"/>
     <w:qFormat/>
     <w:rPr>
       <w:vertAlign w:val="superscript"/>
@@ -3358,15 +3358,15 @@
       <w:shd w:fill="E1DFDD" w:val="clear"/>
     </w:rPr>
   </w:style>
-  <w:style w:type="character" w:styleId="EndnoteCharactersuser" w:customStyle="1">
-    <w:name w:val="Endnote Characters (user)"/>
+  <w:style w:type="character" w:styleId="EndnoteCharacters" w:customStyle="1">
+    <w:name w:val="Endnote Characters"/>
     <w:qFormat/>
     <w:rPr>
       <w:vertAlign w:val="superscript"/>
     </w:rPr>
   </w:style>
-  <w:style w:type="character" w:styleId="EndnoteCharacters" w:customStyle="1">
-    <w:name w:val="Endnote Characters"/>
+  <w:style w:type="character" w:styleId="EndnoteCharactersuser" w:customStyle="1">
+    <w:name w:val="Endnote Characters (user)"/>
     <w:qFormat/>
     <w:rPr>
       <w:vertAlign w:val="superscript"/>
@@ -3667,15 +3667,15 @@
     </w:pPr>
     <w:rPr/>
   </w:style>
-  <w:style w:type="paragraph" w:styleId="FrameContents" w:customStyle="1">
-    <w:name w:val="Frame Contents"/>
+  <w:style w:type="paragraph" w:styleId="FrameContentsuser" w:customStyle="1">
+    <w:name w:val="Frame Contents (user)"/>
     <w:basedOn w:val="Normal"/>
     <w:qFormat/>
     <w:pPr/>
     <w:rPr/>
   </w:style>
-  <w:style w:type="paragraph" w:styleId="FrameContentsuser" w:customStyle="1">
-    <w:name w:val="Frame Contents (user)"/>
+  <w:style w:type="paragraph" w:styleId="FrameContents" w:customStyle="1">
+    <w:name w:val="Frame Contents"/>
     <w:basedOn w:val="Normal"/>
     <w:qFormat/>
     <w:pPr/>

</xml_diff>